<commit_message>
Empfohlene Neuaufnahmen in Referenzlisten und Textanker eingearbeitet
- Alle Neuaufnahmen vorab einzeln verifiziert (Autorenlisten, Titel, Baende,
  Seiten, DOIs); Sensors-Review 23, 8838 (2023) verworfen (topologisch,
  nicht topotaktisch); Ionics-Angabe korrigiert (Song et al., 32, 2427, 2026)
- Emmy Noether (5x): [81]-[88] Sarantopoulos, Mladenovic, Lee, Schulman,
  Antola, Santana, Song, Kunwar mit Textankern im Programmtext
- ERC (5x): [31]-[35] im B1-Kurzzitatstil mit Textankern
- Lynen-Exposes systemspezifisch: STF [29]-[31], PCMO [22]-[23],
  LSFO [22]-[23], LSMO [23]-[24], LNO [23]-[25] (inkl. TiN-freier
  Maas-2022-Bilayer als Beleg der praezisierten Kernaussage)
- Literaturpruefung_2026-08-09 aktualisiert (Einarbeitung dokumentiert,
  offene Leads markiert); alle Markdown-Fassungen neu generiert

Co-Authored-By: Claude Fable 5 <noreply@anthropic.com>
Claude-Session: https://claude.ai/code/session_01Bk7Pr8s2NdP1JMtzGzdQap
</commit_message>
<xml_diff>
--- a/Literaturpruefung_2026-08-09.docx
+++ b/Literaturpruefung_2026-08-09.docx
@@ -1279,7 +1279,7 @@
         <w:spacing w:after="100"/>
       </w:pPr>
       <w:r>
-        <w:t xml:space="preserve">Die zentralen „Lücken“-Behauptungen aller fünf Systeme halten der erneuten Prüfung stand (Stand August 2026). Empfohlene Neuaufnahmen sind unten gelistet; sie sind bewusst noch nicht in die Referenzlisten der Anträge eingefügt, da dies eine Neunummerierung aller Verweise erfordert – Empfehlung: bei der finalen Überarbeitung vor Einreichung einarbeiten.</w:t>
+        <w:t xml:space="preserve">Die zentralen „Lücken“-Behauptungen aller fünf Systeme halten der erneuten Prüfung stand (Stand August 2026). Die empfohlenen Neuaufnahmen wurden am 09.08.2026 – nach Einzelverifikation aller bibliographischen Angaben – in die Referenzlisten und an passende Textstellen der Antragsdokumente eingearbeitet: Emmy Noether [81]–[88] (alle fünf Fassungen), ERC [31]–[35] (alle fünf Fassungen), Lynen-Exposés systemspezifisch (STF [29]–[31], PCMO [22]–[23], LSFO [22]–[23], LSMO [23]–[24], LNO [23]–[25]). Nicht übernommen: das Sensors-Review 23, 8838 (2023) – es behandelt topologische, nicht topotaktische Phasenübergänge und ist thematisch unpassend – sowie zwei nur teilverifizierte Leads (s. Abschnitt 5).</w:t>
       </w:r>
     </w:p>
     <w:tbl>
@@ -1433,7 +1433,7 @@
                 <w:sz w:val="18"/>
                 <w:szCs w:val="18"/>
               </w:rPr>
-              <w:t xml:space="preserve">Sarantopoulos et al., Adv. Electron. Mater. 11, 2400555 (2025), DOI 10.1002/aelm.202400555 (Kinetik/Thermal Confinement) · Mladenović et al., ACS Appl. Electron. Mater. 7, 2839 (2025), DOI 10.1021/acsaelm.4c02350 (terminierungsabhängiges Pt/STO-Schalten) · Materials 17, 5021 (2024), DOI 10.3390/ma17205021 (Sol-Gel-STF-Memristor, Al-Elektrode – zur Abgrenzung der Lücke zitierbar)</w:t>
+              <w:t xml:space="preserve">Eingearbeitet: A. Sarantopoulos, K. Lange, F. Rivadulla, S. Menzel, R. Dittmann, Adv. Electron. Mater. 11, 2400555 (2025), DOI 10.1002/aelm.202400555 (Kinetik/Thermal Confinement) · M. Mladenović et al., ACS Appl. Electron. Mater. 7, 2839–2847 (2025), DOI 10.1021/acsaelm.4c02350 (terminierungsabhängiges Pt/STO-Schalten) · K.-J. Lee et al., Materials 17, 5021 (2024), DOI 10.3390/ma17205021 (Sol-Gel-STF-Memristor, Al-Elektrode – zur Abgrenzung der Lücke)</w:t>
             </w:r>
           </w:p>
         </w:tc>
@@ -1501,7 +1501,7 @@
                 <w:sz w:val="18"/>
                 <w:szCs w:val="18"/>
               </w:rPr>
-              <w:t xml:space="preserve">Schulman, Huhtinen, Paturi, J. Phys. D: Appl. Phys. 57, 422001 (2024), DOI 10.1088/1361-6463/ad6575 (Manganit-Memristor-Review) · Antola et al., ACS Appl. Electron. Mater. 7, 4242 (2025), DOI 10.1021/acsaelm.5c00403 (GCMO, Al vs. Au)</w:t>
+              <w:t xml:space="preserve">Eingearbeitet: A. Schulman, H. Huhtinen, P. Paturi, J. Phys. D: Appl. Phys. 57, 422001 (2024), DOI 10.1088/1361-6463/ad6575 (Manganit-Memristor-Review) · A. Antola et al., ACS Appl. Electron. Mater. 7, 4242–4250 (2025), DOI 10.1021/acsaelm.5c00403 (GCMO, Al vs. Au)</w:t>
             </w:r>
           </w:p>
         </w:tc>
@@ -1569,7 +1569,7 @@
                 <w:sz w:val="18"/>
                 <w:szCs w:val="18"/>
               </w:rPr>
-              <w:t xml:space="preserve">LaFeO3-RRAM-DFT: Ionics (2025), DOI 10.1007/s11581-025-06936-4 · SrFeOx volatil/ferroelektrisch: ACS Appl. Mater. Interfaces 17, 9595 (2025) · Review Topotaktik: Sensors 23, 8838 (2023), DOI 10.3390/s23218838</w:t>
+              <w:t xml:space="preserve">Eingearbeitet: J. A. Santana, J. T. Krogel, P. R. C. Kent, F. A. Reboredo, J. Chem. Phys. 147, 034701 (2017), DOI 10.1063/1.4994083 (DMC-EV für SrFeO3/LaFeO3-Endglieder) · C. Song, H. Luo, J. Xu, Y. Song, Q. Hu, Ionics 32, 2427–2437 (2026), DOI 10.1007/s11581-025-06936-4 (LaFeO3-RRAM-DFT; Jahr/Band gegenüber Empfehlung korrigiert). Verworfen: Sensors 23, 8838 (2023) – behandelt topologische, nicht topotaktische Materialien. Offener Lead: SrFeOx volatil/ferroelektrisch, ACS Appl. Mater. Interfaces 17, 9595 (2025)</w:t>
             </w:r>
           </w:p>
         </w:tc>
@@ -1637,7 +1637,7 @@
                 <w:sz w:val="18"/>
                 <w:szCs w:val="18"/>
               </w:rPr>
-              <w:t xml:space="preserve">Schulman et al., J. Phys. D 57, 422001 (2024) (s. PCMO) · VO2/LSMO/Al2O3-Devices: ACS Appl. Mater. Interfaces (2024), DOI 10.1021/acsami.3c19032</w:t>
+              <w:t xml:space="preserve">Eingearbeitet: A. Schulman et al., J. Phys. D 57, 422001 (2024) (s. PCMO) · S. Kunwar et al., ACS Appl. Mater. Interfaces 16, 19103–19111 (2024), DOI 10.1021/acsami.3c19032 (rekonfigurierbare VO2/LSMO/Al2O3-Devices)</w:t>
             </w:r>
           </w:p>
         </w:tc>
@@ -1705,7 +1705,7 @@
                 <w:sz w:val="18"/>
                 <w:szCs w:val="18"/>
               </w:rPr>
-              <w:t xml:space="preserve">Khuu et al., J. Phys. D 57, 10LT01 (2024), DOI 10.1088/1361-6463/ad1016 (SNN-Synapsen) · O-interkaliertes RP-Nickelat: Mater. Horiz. 13, 2479 (2026), DOI 10.1039/D5MH01394A (7 Größenordnungen Widerstandsmodulation) · Topochemische Oxidation RP-Nickelate: JACS (2025), DOI 10.1021/jacs.5c12712 · TiN-frei (fürs Framing wichtig): J. Mater. Chem. A 10 (2022), DOI 10.1039/D1TA10296F</w:t>
+              <w:t xml:space="preserve">Eingearbeitet: K. Maas, C. Wulles, J. M. Caicedo Roque, B. Ballesteros, V. Lafarge, J. Santiso, M. Burriel, J. Mater. Chem. A 10, 6523–6530 (2022), DOI 10.1039/D1TA10296F (TiN-freie All-Oxid-Bilayer – Beleg der präzisierten Kernaussage) · T.-K. Khuu et al., J. Phys. D 57, 10LT01 (2024), DOI 10.1088/1361-6463/ad1016 (SNN-Synapsen) · Y. Yao et al., Mater. Horiz. 13, 2479–2488 (2026), DOI 10.1039/D5MH01394A (O-interkaliertes RP-Nickelat, Riesen-Widerstandsmodulation). Offener Lead: topochemische Oxidation RP-Nickelate, JACS (2025), DOI 10.1021/jacs.5c12712</w:t>
             </w:r>
           </w:p>
         </w:tc>
@@ -1725,7 +1725,7 @@
         <w:spacing w:after="100"/>
       </w:pPr>
       <w:r>
-        <w:t xml:space="preserve">• Asanuma 2009: exakten Optimum-Wert (x ≈ 0,4) am Volltext/Abbildung verifizieren. • Choi 2013: Al-Topelektrode am PDF bestätigen (Abstract nennt nur Pt-Bottom). • Choi-2013-DOI (10.1016/j.tsf.2012.07.069) nur über Suchtreffer bestätigt. • Empfohlene Neuaufnahmen in die Referenzlisten einarbeiten (Neunummerierung). • Vor der finalen Einreichung ein Scopus/Web-of-Science-Sweep als Gegenprobe zur hier verwendeten Websuche. • Manuskript-Platzhalter [P1]/[E4] und institutionelle Platzhalter unverändert offen (siehe Vergleichsdokument).</w:t>
+        <w:t xml:space="preserve">• Asanuma 2009: exakten Optimum-Wert (x ≈ 0,4) am Volltext/Abbildung verifizieren. • Choi 2013: Al-Topelektrode am PDF bestätigen (Abstract nennt nur Pt-Bottom). • Choi-2013-DOI (10.1016/j.tsf.2012.07.069) nur über Suchtreffer bestätigt. • Zwei offene Literatur-Leads bei Bedarf verifizieren und ergänzen: SrFeOx-Volatile-Switching (ACS Appl. Mater. Interfaces 17, 9595 (2025), DOI unbestätigt) und topochemische RP-Oxidation (JACS, DOI 10.1021/jacs.5c12712, Autorenliste unbestätigt). • Vor der finalen Einreichung ein Scopus/Web-of-Science-Sweep als Gegenprobe zur hier verwendeten Websuche. • Manuskript-Platzhalter [P1]/[E4] und institutionelle Platzhalter unverändert offen (siehe Vergleichsdokument).</w:t>
       </w:r>
     </w:p>
     <w:sectPr>

</xml_diff>